<commit_message>
vault backup: 2026-04-03 19:05:07
</commit_message>
<xml_diff>
--- a/计算机技术学习/漏洞报告/xjgc/新疆工程学院某系统存在会话认证缺陷漏洞.docx
+++ b/计算机技术学习/漏洞报告/xjgc/新疆工程学院某系统存在会话认证缺陷漏洞.docx
@@ -77,7 +77,35 @@
         <w:rPr>
           <w:rStyle w:val="7"/>
         </w:rPr>
-        <w:t>https://nwt.xjtu.edu.cn/jsed/framework/jsMain.jsp</w:t>
+        <w:t>https://</w:t>
+      </w:r>
+      <w:r>
+        <w:rPr>
+          <w:rStyle w:val="7"/>
+          <w:rFonts w:hint="eastAsia"/>
+          <w:lang w:val="en-US" w:eastAsia="zh-CN"/>
+        </w:rPr>
+        <w:t>jwxt</w:t>
+      </w:r>
+      <w:r>
+        <w:rPr>
+          <w:rStyle w:val="7"/>
+        </w:rPr>
+        <w:t>.xj</w:t>
+      </w:r>
+      <w:r>
+        <w:rPr>
+          <w:rStyle w:val="7"/>
+          <w:rFonts w:hint="eastAsia"/>
+          <w:lang w:val="en-US" w:eastAsia="zh-CN"/>
+        </w:rPr>
+        <w:t>ie</w:t>
+      </w:r>
+      <w:r>
+        <w:rPr>
+          <w:rStyle w:val="7"/>
+        </w:rPr>
+        <w:t>.edu.cn/jsed/framework/jsMain.jsp</w:t>
       </w:r>
       <w:r>
         <w:t xml:space="preserve"> 及相关业务接口 </w:t>
@@ -98,25 +126,13 @@
         <w:t>漏洞描述</w:t>
       </w:r>
       <w:r>
-        <w:t xml:space="preserve"> 系统对用户会话标识（</w:t>
-      </w:r>
-      <w:r>
-        <w:rPr>
-          <w:rStyle w:val="7"/>
-        </w:rPr>
-        <w:t>JSESSIONID</w:t>
-      </w:r>
-      <w:r>
-        <w:t xml:space="preserve">）缺乏有效校验，攻击者可通过替换请求中的 </w:t>
-      </w:r>
-      <w:r>
-        <w:rPr>
-          <w:rStyle w:val="7"/>
-        </w:rPr>
-        <w:t>Cookie</w:t>
-      </w:r>
-      <w:r>
-        <w:t xml:space="preserve"> 字段，在无需密码、无需验证码的情况下，直接以其他用户身份执行操作，实现水平越权，查看或修改他人敏感信息。 </w:t>
+        <w:t xml:space="preserve"> </w:t>
+      </w:r>
+      <w:r>
+        <w:rPr>
+          <w:rFonts w:hint="eastAsia"/>
+        </w:rPr>
+        <w:t>新疆工程学院 [XX 核心学生管理系统] 对用户会话标识（JSESSIONID）缺乏有效校验，未将 JSESSIONID 与客户端 IP、User-Agent 等信息进行绑定，也未对会话做严格的有效性验证。攻击者可通过 Burp Suite 等工具抓取合法用户的 JSESSIONID，替换自身请求中的 Cookie 字段，在无需密码、无需验证码、无任何前置权限的情况下，直接以其他用户（学生 / 教职工）身份访问系统，实现水平越权，可随意查看、修改他人的核心敏感信息与业务数据，漏洞利用门槛极低，危害范围覆盖全校。</w:t>
       </w:r>
     </w:p>
     <w:p>
@@ -186,6 +202,7 @@
         <w:keepLines w:val="0"/>
         <w:widowControl/>
         <w:numPr>
+          <w:ilvl w:val="0"/>
           <w:numId w:val="0"/>
         </w:numPr>
         <w:suppressLineNumbers w:val="0"/>
@@ -275,6 +292,7 @@
         <w:keepLines w:val="0"/>
         <w:widowControl/>
         <w:numPr>
+          <w:ilvl w:val="0"/>
           <w:numId w:val="0"/>
         </w:numPr>
         <w:suppressLineNumbers w:val="0"/>
@@ -346,7 +364,39 @@
         <w:ind w:left="720" w:hanging="360"/>
       </w:pPr>
       <w:r>
-        <w:t>页面直接显示账号A的个人信息或业务数据，成功实现水平越权。</w:t>
+        <w:rPr>
+          <w:rFonts w:ascii="宋体" w:hAnsi="宋体" w:eastAsia="宋体" w:cs="宋体"/>
+          <w:sz w:val="24"/>
+          <w:szCs w:val="24"/>
+        </w:rPr>
+        <w:t>页面直接跳转到</w:t>
+      </w:r>
+      <w:r>
+        <w:rPr>
+          <w:rFonts w:hint="eastAsia" w:ascii="宋体" w:hAnsi="宋体" w:eastAsia="宋体" w:cs="宋体"/>
+          <w:sz w:val="24"/>
+          <w:szCs w:val="24"/>
+          <w:lang w:val="en-US" w:eastAsia="zh-CN"/>
+        </w:rPr>
+        <w:t>账号A的核心信息页面</w:t>
+      </w:r>
+      <w:r>
+        <w:rPr>
+          <w:rFonts w:ascii="宋体" w:hAnsi="宋体" w:eastAsia="宋体" w:cs="宋体"/>
+          <w:sz w:val="24"/>
+          <w:szCs w:val="24"/>
+        </w:rPr>
+        <w:t>，可清晰查看账号 A 的学号、身份证号、手机号、成绩、学籍状态等敏感信息；若访问修改类接口，可直接对账号 A 的个人信息 / 学业数据进行编辑、保存，修改操作直接生效，水平越权漏洞复现成功</w:t>
+      </w:r>
+      <w:r>
+        <w:t>。</w:t>
+      </w:r>
+      <w:r>
+        <w:rPr>
+          <w:rFonts w:hint="eastAsia"/>
+          <w:lang w:val="en-US" w:eastAsia="zh-CN"/>
+        </w:rPr>
+        <w:t>如图，可直接修改账号A的个人账号资料。</w:t>
       </w:r>
     </w:p>
     <w:p>
@@ -355,6 +405,7 @@
         <w:keepLines w:val="0"/>
         <w:widowControl/>
         <w:numPr>
+          <w:ilvl w:val="0"/>
           <w:numId w:val="0"/>
         </w:numPr>
         <w:suppressLineNumbers w:val="0"/>
@@ -435,6 +486,302 @@
     </w:p>
     <w:p>
       <w:pPr>
+        <w:keepNext w:val="0"/>
+        <w:keepLines w:val="0"/>
+        <w:widowControl/>
+        <w:suppressLineNumbers w:val="0"/>
+        <w:pBdr>
+          <w:top w:val="none" w:color="auto" w:sz="0" w:space="0"/>
+          <w:left w:val="none" w:color="auto" w:sz="0" w:space="0"/>
+          <w:bottom w:val="none" w:color="auto" w:sz="0" w:space="0"/>
+          <w:right w:val="none" w:color="auto" w:sz="0" w:space="0"/>
+        </w:pBdr>
+        <w:spacing w:before="0" w:beforeAutospacing="0" w:after="0" w:afterAutospacing="0" w:line="240" w:lineRule="atLeast"/>
+        <w:ind w:left="0" w:right="0"/>
+      </w:pPr>
+      <w:r>
+        <w:t>漏洞影响</w:t>
+      </w:r>
+    </w:p>
+    <w:p>
+      <w:pPr>
+        <w:keepNext w:val="0"/>
+        <w:keepLines w:val="0"/>
+        <w:widowControl/>
+        <w:suppressLineNumbers w:val="0"/>
+        <w:pBdr>
+          <w:top w:val="none" w:color="auto" w:sz="0" w:space="0"/>
+          <w:left w:val="none" w:color="auto" w:sz="0" w:space="0"/>
+          <w:bottom w:val="none" w:color="auto" w:sz="0" w:space="0"/>
+          <w:right w:val="none" w:color="auto" w:sz="0" w:space="0"/>
+        </w:pBdr>
+        <w:spacing w:before="0" w:beforeAutospacing="0" w:after="0" w:afterAutospacing="0" w:line="240" w:lineRule="atLeast"/>
+        <w:ind w:left="0" w:right="0"/>
+        <w:rPr>
+          <w:rFonts w:hint="eastAsia" w:ascii="宋体" w:hAnsi="宋体" w:eastAsia="宋体" w:cs="宋体"/>
+          <w:color w:val="000000"/>
+          <w:sz w:val="21"/>
+          <w:szCs w:val="21"/>
+        </w:rPr>
+      </w:pPr>
+      <w:r>
+        <w:rPr>
+          <w:rFonts w:hint="eastAsia" w:ascii="宋体" w:hAnsi="宋体" w:eastAsia="宋体" w:cs="宋体"/>
+          <w:sz w:val="21"/>
+          <w:szCs w:val="21"/>
+        </w:rPr>
+        <w:t>·</w:t>
+      </w:r>
+      <w:r>
+        <w:rPr>
+          <w:rFonts w:hint="eastAsia" w:ascii="宋体" w:hAnsi="宋体" w:eastAsia="宋体" w:cs="宋体"/>
+          <w:sz w:val="21"/>
+          <w:szCs w:val="21"/>
+        </w:rPr>
+        <w:t xml:space="preserve">  </w:t>
+      </w:r>
+      <w:r>
+        <w:rPr>
+          <w:rStyle w:val="6"/>
+          <w:rFonts w:hint="eastAsia" w:ascii="宋体" w:hAnsi="宋体" w:eastAsia="宋体" w:cs="宋体"/>
+          <w:b/>
+          <w:bCs/>
+          <w:color w:val="000000"/>
+          <w:sz w:val="21"/>
+          <w:szCs w:val="21"/>
+          <w:bdr w:val="none" w:color="auto" w:sz="0" w:space="0"/>
+        </w:rPr>
+        <w:t>机密性重大破坏</w:t>
+      </w:r>
+      <w:r>
+        <w:rPr>
+          <w:rFonts w:hint="eastAsia" w:ascii="宋体" w:hAnsi="宋体" w:eastAsia="宋体" w:cs="宋体"/>
+          <w:color w:val="000000"/>
+          <w:sz w:val="21"/>
+          <w:szCs w:val="21"/>
+          <w:bdr w:val="none" w:color="auto" w:sz="0" w:space="0"/>
+        </w:rPr>
+        <w:t>：攻击者可批量抓取合法用户 JSESSIONID，无授权获取</w:t>
+      </w:r>
+      <w:r>
+        <w:rPr>
+          <w:rStyle w:val="6"/>
+          <w:rFonts w:hint="eastAsia" w:ascii="宋体" w:hAnsi="宋体" w:eastAsia="宋体" w:cs="宋体"/>
+          <w:b/>
+          <w:bCs/>
+          <w:color w:val="000000"/>
+          <w:sz w:val="21"/>
+          <w:szCs w:val="21"/>
+          <w:bdr w:val="none" w:color="auto" w:sz="0" w:space="0"/>
+        </w:rPr>
+        <w:t>全校数千名学生的身份证号、手机号、家庭住址、学业成绩、学籍状态等核心敏感个人信息</w:t>
+      </w:r>
+      <w:r>
+        <w:rPr>
+          <w:rFonts w:hint="eastAsia" w:ascii="宋体" w:hAnsi="宋体" w:eastAsia="宋体" w:cs="宋体"/>
+          <w:color w:val="000000"/>
+          <w:sz w:val="21"/>
+          <w:szCs w:val="21"/>
+          <w:bdr w:val="none" w:color="auto" w:sz="0" w:space="0"/>
+        </w:rPr>
+        <w:t>，构成大规模个人信息泄露，违反《个人信息保护法》第 40 条、《网络安全法》第 21 条，涉嫌侵害学生合法权益；</w:t>
+      </w:r>
+    </w:p>
+    <w:p>
+      <w:pPr>
+        <w:keepNext w:val="0"/>
+        <w:keepLines w:val="0"/>
+        <w:widowControl/>
+        <w:suppressLineNumbers w:val="0"/>
+        <w:pBdr>
+          <w:top w:val="none" w:color="auto" w:sz="0" w:space="0"/>
+          <w:left w:val="none" w:color="auto" w:sz="0" w:space="0"/>
+          <w:bottom w:val="none" w:color="auto" w:sz="0" w:space="0"/>
+          <w:right w:val="none" w:color="auto" w:sz="0" w:space="0"/>
+        </w:pBdr>
+        <w:spacing w:before="0" w:beforeAutospacing="0" w:after="0" w:afterAutospacing="0" w:line="240" w:lineRule="atLeast"/>
+        <w:ind w:left="0" w:right="0"/>
+        <w:rPr>
+          <w:rFonts w:hint="eastAsia" w:ascii="宋体" w:hAnsi="宋体" w:eastAsia="宋体" w:cs="宋体"/>
+          <w:color w:val="000000"/>
+          <w:sz w:val="21"/>
+          <w:szCs w:val="21"/>
+        </w:rPr>
+      </w:pPr>
+      <w:r>
+        <w:rPr>
+          <w:rFonts w:hint="eastAsia" w:ascii="宋体" w:hAnsi="宋体" w:eastAsia="宋体" w:cs="宋体"/>
+          <w:sz w:val="21"/>
+          <w:szCs w:val="21"/>
+        </w:rPr>
+        <w:t>·</w:t>
+      </w:r>
+      <w:r>
+        <w:rPr>
+          <w:rFonts w:hint="eastAsia" w:ascii="宋体" w:hAnsi="宋体" w:eastAsia="宋体" w:cs="宋体"/>
+          <w:sz w:val="21"/>
+          <w:szCs w:val="21"/>
+        </w:rPr>
+        <w:t xml:space="preserve">  </w:t>
+      </w:r>
+      <w:r>
+        <w:rPr>
+          <w:rStyle w:val="6"/>
+          <w:rFonts w:hint="eastAsia" w:ascii="宋体" w:hAnsi="宋体" w:eastAsia="宋体" w:cs="宋体"/>
+          <w:b/>
+          <w:bCs/>
+          <w:color w:val="000000"/>
+          <w:sz w:val="21"/>
+          <w:szCs w:val="21"/>
+          <w:bdr w:val="none" w:color="auto" w:sz="0" w:space="0"/>
+        </w:rPr>
+        <w:t>完整性重大破坏</w:t>
+      </w:r>
+      <w:r>
+        <w:rPr>
+          <w:rFonts w:hint="eastAsia" w:ascii="宋体" w:hAnsi="宋体" w:eastAsia="宋体" w:cs="宋体"/>
+          <w:color w:val="000000"/>
+          <w:sz w:val="21"/>
+          <w:szCs w:val="21"/>
+          <w:bdr w:val="none" w:color="auto" w:sz="0" w:space="0"/>
+        </w:rPr>
+        <w:t>：攻击者可越权修改他人的个人资料、选课记录、成绩备注、学籍信息等核心教务数据，直接干扰学校正常的教学管理秩序，引发教育公平问题，对学校的教学工作造成实质性破坏；</w:t>
+      </w:r>
+      <w:bookmarkStart w:id="0" w:name="_GoBack"/>
+      <w:bookmarkEnd w:id="0"/>
+    </w:p>
+    <w:p>
+      <w:pPr>
+        <w:keepNext w:val="0"/>
+        <w:keepLines w:val="0"/>
+        <w:widowControl/>
+        <w:suppressLineNumbers w:val="0"/>
+        <w:pBdr>
+          <w:top w:val="none" w:color="auto" w:sz="0" w:space="0"/>
+          <w:left w:val="none" w:color="auto" w:sz="0" w:space="0"/>
+          <w:bottom w:val="none" w:color="auto" w:sz="0" w:space="0"/>
+          <w:right w:val="none" w:color="auto" w:sz="0" w:space="0"/>
+        </w:pBdr>
+        <w:spacing w:before="0" w:beforeAutospacing="0" w:after="0" w:afterAutospacing="0" w:line="240" w:lineRule="atLeast"/>
+        <w:ind w:left="0" w:right="0"/>
+        <w:rPr>
+          <w:rFonts w:hint="eastAsia" w:ascii="宋体" w:hAnsi="宋体" w:eastAsia="宋体" w:cs="宋体"/>
+          <w:color w:val="000000"/>
+          <w:sz w:val="21"/>
+          <w:szCs w:val="21"/>
+        </w:rPr>
+      </w:pPr>
+      <w:r>
+        <w:rPr>
+          <w:rFonts w:hint="eastAsia" w:ascii="宋体" w:hAnsi="宋体" w:eastAsia="宋体" w:cs="宋体"/>
+          <w:sz w:val="21"/>
+          <w:szCs w:val="21"/>
+        </w:rPr>
+        <w:t>·</w:t>
+      </w:r>
+      <w:r>
+        <w:rPr>
+          <w:rFonts w:hint="eastAsia" w:ascii="宋体" w:hAnsi="宋体" w:eastAsia="宋体" w:cs="宋体"/>
+          <w:sz w:val="21"/>
+          <w:szCs w:val="21"/>
+        </w:rPr>
+        <w:t xml:space="preserve">  </w:t>
+      </w:r>
+      <w:r>
+        <w:rPr>
+          <w:rStyle w:val="6"/>
+          <w:rFonts w:hint="eastAsia" w:ascii="宋体" w:hAnsi="宋体" w:eastAsia="宋体" w:cs="宋体"/>
+          <w:b/>
+          <w:bCs/>
+          <w:color w:val="000000"/>
+          <w:sz w:val="21"/>
+          <w:szCs w:val="21"/>
+          <w:bdr w:val="none" w:color="auto" w:sz="0" w:space="0"/>
+        </w:rPr>
+        <w:t>利用门槛极低，危害范围极广</w:t>
+      </w:r>
+      <w:r>
+        <w:rPr>
+          <w:rFonts w:hint="eastAsia" w:ascii="宋体" w:hAnsi="宋体" w:eastAsia="宋体" w:cs="宋体"/>
+          <w:color w:val="000000"/>
+          <w:sz w:val="21"/>
+          <w:szCs w:val="21"/>
+          <w:bdr w:val="none" w:color="auto" w:sz="0" w:space="0"/>
+        </w:rPr>
+        <w:t>：该漏洞无需任何专业渗透技术，仅需简单的抓包、替换 Cookie 操作即可实现，任何普通攻击者均可利用，且漏洞影响覆盖全校所有学生，易引发恶性信息泄露 / 数据篡改事件，对学校的社会声誉造成严重负面影响；</w:t>
+      </w:r>
+    </w:p>
+    <w:p>
+      <w:pPr>
+        <w:keepNext w:val="0"/>
+        <w:keepLines w:val="0"/>
+        <w:widowControl/>
+        <w:suppressLineNumbers w:val="0"/>
+        <w:pBdr>
+          <w:top w:val="none" w:color="auto" w:sz="0" w:space="0"/>
+          <w:left w:val="none" w:color="auto" w:sz="0" w:space="0"/>
+          <w:bottom w:val="none" w:color="auto" w:sz="0" w:space="0"/>
+          <w:right w:val="none" w:color="auto" w:sz="0" w:space="0"/>
+        </w:pBdr>
+        <w:spacing w:before="0" w:beforeAutospacing="0" w:after="0" w:afterAutospacing="0" w:line="240" w:lineRule="atLeast"/>
+        <w:ind w:left="0" w:right="0"/>
+        <w:rPr>
+          <w:rFonts w:hint="eastAsia" w:ascii="宋体" w:hAnsi="宋体" w:eastAsia="宋体" w:cs="宋体"/>
+          <w:color w:val="000000"/>
+          <w:sz w:val="21"/>
+          <w:szCs w:val="21"/>
+        </w:rPr>
+      </w:pPr>
+      <w:r>
+        <w:rPr>
+          <w:rFonts w:hint="eastAsia" w:ascii="宋体" w:hAnsi="宋体" w:eastAsia="宋体" w:cs="宋体"/>
+          <w:sz w:val="21"/>
+          <w:szCs w:val="21"/>
+        </w:rPr>
+        <w:t>·</w:t>
+      </w:r>
+      <w:r>
+        <w:rPr>
+          <w:rFonts w:hint="eastAsia" w:ascii="宋体" w:hAnsi="宋体" w:eastAsia="宋体" w:cs="宋体"/>
+          <w:sz w:val="21"/>
+          <w:szCs w:val="21"/>
+        </w:rPr>
+        <w:t xml:space="preserve">  </w:t>
+      </w:r>
+      <w:r>
+        <w:rPr>
+          <w:rStyle w:val="6"/>
+          <w:rFonts w:hint="eastAsia" w:ascii="宋体" w:hAnsi="宋体" w:eastAsia="宋体" w:cs="宋体"/>
+          <w:b/>
+          <w:bCs/>
+          <w:color w:val="000000"/>
+          <w:sz w:val="21"/>
+          <w:szCs w:val="21"/>
+          <w:bdr w:val="none" w:color="auto" w:sz="0" w:space="0"/>
+        </w:rPr>
+        <w:t>可进一步横向渗透</w:t>
+      </w:r>
+      <w:r>
+        <w:rPr>
+          <w:rFonts w:hint="eastAsia" w:ascii="宋体" w:hAnsi="宋体" w:eastAsia="宋体" w:cs="宋体"/>
+          <w:color w:val="000000"/>
+          <w:sz w:val="21"/>
+          <w:szCs w:val="21"/>
+          <w:bdr w:val="none" w:color="auto" w:sz="0" w:space="0"/>
+        </w:rPr>
+        <w:t>：攻击者可通过越权获取的教职工账号，进一步尝试访问学校教务系统的后台管理功能，引发更严重的权限泄露与业务破坏。</w:t>
+      </w:r>
+    </w:p>
+    <w:p>
+      <w:pPr>
+        <w:keepNext w:val="0"/>
+        <w:keepLines w:val="0"/>
+        <w:widowControl/>
+        <w:suppressLineNumbers w:val="0"/>
+      </w:pPr>
+    </w:p>
+    <w:p>
+      <w:pPr>
         <w:pStyle w:val="2"/>
         <w:keepNext w:val="0"/>
         <w:keepLines w:val="0"/>
@@ -442,7 +789,7 @@
         <w:suppressLineNumbers w:val="0"/>
       </w:pPr>
       <w:r>
-        <w:t>漏洞影响</w:t>
+        <w:t>修复建议</w:t>
       </w:r>
     </w:p>
     <w:p>
@@ -459,7 +806,22 @@
         <w:ind w:left="720" w:hanging="360"/>
       </w:pPr>
       <w:r>
-        <w:t xml:space="preserve">攻击者可批量获取大量用户的敏感信息，如个人资料、联系方式、学习/工作记录等。 </w:t>
+        <w:rPr>
+          <w:rStyle w:val="6"/>
+        </w:rPr>
+        <w:t>绑定会话与客户端信息</w:t>
+      </w:r>
+      <w:r>
+        <w:t xml:space="preserve">：在服务端生成会话时，将 </w:t>
+      </w:r>
+      <w:r>
+        <w:rPr>
+          <w:rStyle w:val="7"/>
+        </w:rPr>
+        <w:t>JSESSIONID</w:t>
+      </w:r>
+      <w:r>
+        <w:t xml:space="preserve"> 与客户端的IP地址、User-Agent等信息进行绑定。每次请求时，校验这些信息是否一致，不一致则销毁会话。 </w:t>
       </w:r>
     </w:p>
     <w:p>
@@ -476,40 +838,13 @@
         <w:ind w:left="720" w:hanging="360"/>
       </w:pPr>
       <w:r>
-        <w:t>攻击者可完全控制受害者账号，进行修改密码、提交数据、删除信息等恶意操作。</w:t>
-      </w:r>
-    </w:p>
-    <w:p>
-      <w:pPr>
-        <w:keepNext w:val="0"/>
-        <w:keepLines w:val="0"/>
-        <w:widowControl/>
-        <w:suppressLineNumbers w:val="0"/>
-      </w:pPr>
-      <w:r>
-        <w:pict>
-          <v:rect id="_x0000_i1026" o:spt="1" style="height:1.5pt;width:432pt;" fillcolor="#A0A0A0" filled="t" stroked="f" coordsize="21600,21600" o:hr="t" o:hrstd="t" o:hralign="center">
-            <v:path/>
-            <v:fill on="t" focussize="0,0"/>
-            <v:stroke on="f"/>
-            <v:imagedata o:title=""/>
-            <o:lock v:ext="edit"/>
-            <w10:wrap type="none"/>
-            <w10:anchorlock/>
-          </v:rect>
-        </w:pict>
-      </w:r>
-    </w:p>
-    <w:p>
-      <w:pPr>
-        <w:pStyle w:val="2"/>
-        <w:keepNext w:val="0"/>
-        <w:keepLines w:val="0"/>
-        <w:widowControl/>
-        <w:suppressLineNumbers w:val="0"/>
-      </w:pPr>
-      <w:r>
-        <w:t>修复建议</w:t>
+        <w:rPr>
+          <w:rStyle w:val="6"/>
+        </w:rPr>
+        <w:t>增加会话有效期与强制验证</w:t>
+      </w:r>
+      <w:r>
+        <w:t xml:space="preserve">：设置合理的会话超时时间，对敏感操作（如修改密码、查看隐私信息）要求用户重新输入密码或进行二次验证。 </w:t>
       </w:r>
     </w:p>
     <w:p>
@@ -519,7 +854,7 @@
         <w:widowControl/>
         <w:numPr>
           <w:ilvl w:val="0"/>
-          <w:numId w:val="3"/>
+          <w:numId w:val="2"/>
         </w:numPr>
         <w:suppressLineNumbers w:val="0"/>
         <w:spacing w:before="0" w:beforeAutospacing="1" w:after="0" w:afterAutospacing="1"/>
@@ -529,71 +864,13 @@
         <w:rPr>
           <w:rStyle w:val="6"/>
         </w:rPr>
-        <w:t>绑定会话与客户端信息</w:t>
-      </w:r>
-      <w:r>
-        <w:t xml:space="preserve">：在服务端生成会话时，将 </w:t>
-      </w:r>
-      <w:r>
-        <w:rPr>
-          <w:rStyle w:val="7"/>
-        </w:rPr>
-        <w:t>JSESSIONID</w:t>
-      </w:r>
-      <w:r>
-        <w:t xml:space="preserve"> 与客户端的IP地址、User-Agent等信息进行绑定。每次请求时，校验这些信息是否一致，不一致则销毁会话。 </w:t>
-      </w:r>
-    </w:p>
-    <w:p>
-      <w:pPr>
-        <w:keepNext w:val="0"/>
-        <w:keepLines w:val="0"/>
-        <w:widowControl/>
-        <w:numPr>
-          <w:ilvl w:val="0"/>
-          <w:numId w:val="3"/>
-        </w:numPr>
-        <w:suppressLineNumbers w:val="0"/>
-        <w:spacing w:before="0" w:beforeAutospacing="1" w:after="0" w:afterAutospacing="1"/>
-        <w:ind w:left="720" w:hanging="360"/>
-      </w:pPr>
-      <w:r>
-        <w:rPr>
-          <w:rStyle w:val="6"/>
-        </w:rPr>
-        <w:t>增加会话有效期与强制验证</w:t>
-      </w:r>
-      <w:r>
-        <w:t xml:space="preserve">：设置合理的会话超时时间，对敏感操作（如修改密码、查看隐私信息）要求用户重新输入密码或进行二次验证。 </w:t>
-      </w:r>
-    </w:p>
-    <w:p>
-      <w:pPr>
-        <w:keepNext w:val="0"/>
-        <w:keepLines w:val="0"/>
-        <w:widowControl/>
-        <w:numPr>
-          <w:ilvl w:val="0"/>
-          <w:numId w:val="3"/>
-        </w:numPr>
-        <w:suppressLineNumbers w:val="0"/>
-        <w:spacing w:before="0" w:beforeAutospacing="1" w:after="0" w:afterAutospacing="1"/>
-        <w:ind w:left="720" w:hanging="360"/>
-      </w:pPr>
-      <w:r>
-        <w:rPr>
-          <w:rStyle w:val="6"/>
-        </w:rPr>
         <w:t>使用更安全的会话管理机制</w:t>
       </w:r>
       <w:r>
         <w:t>：考虑使用HttpOnly、Secure等Cookie属性，防止XSS等攻击窃取Cookie；或采用Token-based认证，并对Token进行签名和时效控制。</w:t>
       </w:r>
     </w:p>
-    <w:p>
-      <w:bookmarkStart w:id="0" w:name="_GoBack"/>
-      <w:bookmarkEnd w:id="0"/>
-    </w:p>
+    <w:p/>
     <w:sectPr>
       <w:pgSz w:w="11906" w:h="16838"/>
       <w:pgMar w:top="1440" w:right="1800" w:bottom="1440" w:left="1800" w:header="851" w:footer="992" w:gutter="0"/>
@@ -904,162 +1181,10 @@
       </w:rPr>
     </w:lvl>
   </w:abstractNum>
-  <w:abstractNum w:abstractNumId="2">
-    <w:nsid w:val="6DA1E422"/>
-    <w:multiLevelType w:val="multilevel"/>
-    <w:tmpl w:val="6DA1E422"/>
-    <w:lvl w:ilvl="0" w:tentative="0">
-      <w:start w:val="1"/>
-      <w:numFmt w:val="bullet"/>
-      <w:lvlText w:val=""/>
-      <w:lvlJc w:val="left"/>
-      <w:pPr>
-        <w:tabs>
-          <w:tab w:val="left" w:pos="720"/>
-        </w:tabs>
-        <w:ind w:left="720" w:hanging="360"/>
-      </w:pPr>
-      <w:rPr>
-        <w:rFonts w:ascii="Symbol" w:hAnsi="Symbol" w:cs="Symbol"/>
-        <w:sz w:val="20"/>
-      </w:rPr>
-    </w:lvl>
-    <w:lvl w:ilvl="1" w:tentative="0">
-      <w:start w:val="1"/>
-      <w:numFmt w:val="bullet"/>
-      <w:lvlText w:val="o"/>
-      <w:lvlJc w:val="left"/>
-      <w:pPr>
-        <w:tabs>
-          <w:tab w:val="left" w:pos="1440"/>
-        </w:tabs>
-        <w:ind w:left="1440" w:hanging="360"/>
-      </w:pPr>
-      <w:rPr>
-        <w:rFonts w:ascii="Courier New" w:hAnsi="Courier New" w:cs="Courier New"/>
-        <w:sz w:val="20"/>
-      </w:rPr>
-    </w:lvl>
-    <w:lvl w:ilvl="2" w:tentative="0">
-      <w:start w:val="1"/>
-      <w:numFmt w:val="bullet"/>
-      <w:lvlText w:val=""/>
-      <w:lvlJc w:val="left"/>
-      <w:pPr>
-        <w:tabs>
-          <w:tab w:val="left" w:pos="2160"/>
-        </w:tabs>
-        <w:ind w:left="2160" w:hanging="360"/>
-      </w:pPr>
-      <w:rPr>
-        <w:rFonts w:ascii="Wingdings" w:hAnsi="Wingdings" w:cs="Wingdings"/>
-        <w:sz w:val="20"/>
-      </w:rPr>
-    </w:lvl>
-    <w:lvl w:ilvl="3" w:tentative="0">
-      <w:start w:val="1"/>
-      <w:numFmt w:val="bullet"/>
-      <w:lvlText w:val=""/>
-      <w:lvlJc w:val="left"/>
-      <w:pPr>
-        <w:tabs>
-          <w:tab w:val="left" w:pos="2880"/>
-        </w:tabs>
-        <w:ind w:left="2880" w:hanging="360"/>
-      </w:pPr>
-      <w:rPr>
-        <w:rFonts w:hint="default" w:ascii="Wingdings" w:hAnsi="Wingdings" w:cs="Wingdings"/>
-        <w:sz w:val="20"/>
-      </w:rPr>
-    </w:lvl>
-    <w:lvl w:ilvl="4" w:tentative="0">
-      <w:start w:val="1"/>
-      <w:numFmt w:val="bullet"/>
-      <w:lvlText w:val=""/>
-      <w:lvlJc w:val="left"/>
-      <w:pPr>
-        <w:tabs>
-          <w:tab w:val="left" w:pos="3600"/>
-        </w:tabs>
-        <w:ind w:left="3600" w:hanging="360"/>
-      </w:pPr>
-      <w:rPr>
-        <w:rFonts w:hint="default" w:ascii="Wingdings" w:hAnsi="Wingdings" w:cs="Wingdings"/>
-        <w:sz w:val="20"/>
-      </w:rPr>
-    </w:lvl>
-    <w:lvl w:ilvl="5" w:tentative="0">
-      <w:start w:val="1"/>
-      <w:numFmt w:val="bullet"/>
-      <w:lvlText w:val=""/>
-      <w:lvlJc w:val="left"/>
-      <w:pPr>
-        <w:tabs>
-          <w:tab w:val="left" w:pos="4320"/>
-        </w:tabs>
-        <w:ind w:left="4320" w:hanging="360"/>
-      </w:pPr>
-      <w:rPr>
-        <w:rFonts w:hint="default" w:ascii="Wingdings" w:hAnsi="Wingdings" w:cs="Wingdings"/>
-        <w:sz w:val="20"/>
-      </w:rPr>
-    </w:lvl>
-    <w:lvl w:ilvl="6" w:tentative="0">
-      <w:start w:val="1"/>
-      <w:numFmt w:val="bullet"/>
-      <w:lvlText w:val=""/>
-      <w:lvlJc w:val="left"/>
-      <w:pPr>
-        <w:tabs>
-          <w:tab w:val="left" w:pos="5040"/>
-        </w:tabs>
-        <w:ind w:left="5040" w:hanging="360"/>
-      </w:pPr>
-      <w:rPr>
-        <w:rFonts w:hint="default" w:ascii="Wingdings" w:hAnsi="Wingdings" w:cs="Wingdings"/>
-        <w:sz w:val="20"/>
-      </w:rPr>
-    </w:lvl>
-    <w:lvl w:ilvl="7" w:tentative="0">
-      <w:start w:val="1"/>
-      <w:numFmt w:val="bullet"/>
-      <w:lvlText w:val=""/>
-      <w:lvlJc w:val="left"/>
-      <w:pPr>
-        <w:tabs>
-          <w:tab w:val="left" w:pos="5760"/>
-        </w:tabs>
-        <w:ind w:left="5760" w:hanging="360"/>
-      </w:pPr>
-      <w:rPr>
-        <w:rFonts w:hint="default" w:ascii="Wingdings" w:hAnsi="Wingdings" w:cs="Wingdings"/>
-        <w:sz w:val="20"/>
-      </w:rPr>
-    </w:lvl>
-    <w:lvl w:ilvl="8" w:tentative="0">
-      <w:start w:val="1"/>
-      <w:numFmt w:val="bullet"/>
-      <w:lvlText w:val=""/>
-      <w:lvlJc w:val="left"/>
-      <w:pPr>
-        <w:tabs>
-          <w:tab w:val="left" w:pos="6480"/>
-        </w:tabs>
-        <w:ind w:left="6480" w:hanging="360"/>
-      </w:pPr>
-      <w:rPr>
-        <w:rFonts w:hint="default" w:ascii="Wingdings" w:hAnsi="Wingdings" w:cs="Wingdings"/>
-        <w:sz w:val="20"/>
-      </w:rPr>
-    </w:lvl>
-  </w:abstractNum>
   <w:num w:numId="1">
     <w:abstractNumId w:val="0"/>
   </w:num>
   <w:num w:numId="2">
-    <w:abstractNumId w:val="2"/>
-  </w:num>
-  <w:num w:numId="3">
     <w:abstractNumId w:val="1"/>
   </w:num>
 </w:numbering>

</xml_diff>

<commit_message>
vault backup: 2026-04-03 19:11:39
</commit_message>
<xml_diff>
--- a/计算机技术学习/漏洞报告/xjgc/新疆工程学院某系统存在会话认证缺陷漏洞.docx
+++ b/计算机技术学习/漏洞报告/xjgc/新疆工程学院某系统存在会话认证缺陷漏洞.docx
@@ -149,6 +149,57 @@
     </w:p>
     <w:p>
       <w:pPr>
+        <w:pStyle w:val="3"/>
+        <w:keepNext w:val="0"/>
+        <w:keepLines w:val="0"/>
+        <w:widowControl/>
+        <w:suppressLineNumbers w:val="0"/>
+      </w:pPr>
+      <w:r>
+        <w:t>账号 A：2024211681(刘</w:t>
+      </w:r>
+      <w:r>
+        <w:rPr>
+          <w:rStyle w:val="6"/>
+        </w:rPr>
+        <w:t>)</w:t>
+      </w:r>
+      <w:r>
+        <w:rPr>
+          <w:rStyle w:val="6"/>
+        </w:rPr>
+        <w:br w:type="textWrapping"/>
+      </w:r>
+      <w:r>
+        <w:rPr>
+          <w:rStyle w:val="6"/>
+        </w:rPr>
+        <w:t>密码 A：123qqq,,,</w:t>
+      </w:r>
+      <w:r>
+        <w:rPr>
+          <w:rStyle w:val="6"/>
+        </w:rPr>
+        <w:br w:type="textWrapping"/>
+      </w:r>
+      <w:r>
+        <w:rPr>
+          <w:rStyle w:val="6"/>
+        </w:rPr>
+        <w:t>账号 B：2024211408(付</w:t>
+      </w:r>
+      <w:r>
+        <w:t>)</w:t>
+      </w:r>
+      <w:r>
+        <w:br w:type="textWrapping"/>
+      </w:r>
+      <w:r>
+        <w:t>密码 B：gcxy111111</w:t>
+      </w:r>
+    </w:p>
+    <w:p>
+      <w:pPr>
         <w:keepNext w:val="0"/>
         <w:keepLines w:val="0"/>
         <w:widowControl/>
@@ -163,6 +214,19 @@
       <w:r>
         <w:t xml:space="preserve">登录账号A，获取其会话Cookie： </w:t>
       </w:r>
+    </w:p>
+    <w:p>
+      <w:pPr>
+        <w:keepNext w:val="0"/>
+        <w:keepLines w:val="0"/>
+        <w:widowControl/>
+        <w:numPr>
+          <w:numId w:val="0"/>
+        </w:numPr>
+        <w:suppressLineNumbers w:val="0"/>
+        <w:spacing w:before="0" w:beforeAutospacing="1" w:after="0" w:afterAutospacing="1"/>
+        <w:ind w:left="360" w:leftChars="0"/>
+      </w:pPr>
       <w:r>
         <w:rPr>
           <w:rStyle w:val="7"/>
@@ -647,8 +711,6 @@
         </w:rPr>
         <w:t>：攻击者可越权修改他人的个人资料、选课记录、成绩备注、学籍信息等核心教务数据，直接干扰学校正常的教学管理秩序，引发教育公平问题，对学校的教学工作造成实质性破坏；</w:t>
       </w:r>
-      <w:bookmarkStart w:id="0" w:name="_GoBack"/>
-      <w:bookmarkEnd w:id="0"/>
     </w:p>
     <w:p>
       <w:pPr>
@@ -870,7 +932,10 @@
         <w:t>：考虑使用HttpOnly、Secure等Cookie属性，防止XSS等攻击窃取Cookie；或采用Token-based认证，并对Token进行签名和时效控制。</w:t>
       </w:r>
     </w:p>
-    <w:p/>
+    <w:p>
+      <w:bookmarkStart w:id="0" w:name="_GoBack"/>
+      <w:bookmarkEnd w:id="0"/>
+    </w:p>
     <w:sectPr>
       <w:pgSz w:w="11906" w:h="16838"/>
       <w:pgMar w:top="1440" w:right="1800" w:bottom="1440" w:left="1800" w:header="851" w:footer="992" w:gutter="0"/>

</xml_diff>

<commit_message>
vault backup: 2026-04-03 19:13:45
</commit_message>
<xml_diff>
--- a/计算机技术学习/漏洞报告/xjgc/新疆工程学院某系统存在会话认证缺陷漏洞.docx
+++ b/计算机技术学习/漏洞报告/xjgc/新疆工程学院某系统存在会话认证缺陷漏洞.docx
@@ -212,7 +212,17 @@
         <w:ind w:left="720" w:hanging="360"/>
       </w:pPr>
       <w:r>
-        <w:t xml:space="preserve">登录账号A，获取其会话Cookie： </w:t>
+        <w:t>登录账号A</w:t>
+      </w:r>
+      <w:r>
+        <w:rPr>
+          <w:rFonts w:hint="eastAsia"/>
+          <w:lang w:val="en-US" w:eastAsia="zh-CN"/>
+        </w:rPr>
+        <w:t>(刘**)</w:t>
+      </w:r>
+      <w:r>
+        <w:t xml:space="preserve">，获取其会话Cookie： </w:t>
       </w:r>
     </w:p>
     <w:p>
@@ -226,12 +236,77 @@
         <w:suppressLineNumbers w:val="0"/>
         <w:spacing w:before="0" w:beforeAutospacing="1" w:after="0" w:afterAutospacing="1"/>
         <w:ind w:left="360" w:leftChars="0"/>
-      </w:pPr>
-      <w:r>
         <w:rPr>
           <w:rStyle w:val="7"/>
         </w:rPr>
+      </w:pPr>
+      <w:r>
+        <w:rPr>
+          <w:rStyle w:val="7"/>
+        </w:rPr>
         <w:t>Cookie: JSESSIONID=6BFA28BA4F5CCEE4742E9FCFA345C03A; SERVERID=122; JSESSIONID=3EED1D5D7446799F1F3D3898AD152D88</w:t>
+      </w:r>
+    </w:p>
+    <w:p>
+      <w:pPr>
+        <w:keepNext w:val="0"/>
+        <w:keepLines w:val="0"/>
+        <w:widowControl/>
+        <w:numPr>
+          <w:numId w:val="0"/>
+        </w:numPr>
+        <w:suppressLineNumbers w:val="0"/>
+        <w:spacing w:before="0" w:beforeAutospacing="1" w:after="0" w:afterAutospacing="1"/>
+        <w:ind w:left="360" w:leftChars="0"/>
+        <w:rPr>
+          <w:rStyle w:val="7"/>
+          <w:rFonts w:hint="eastAsia" w:eastAsiaTheme="minorEastAsia"/>
+          <w:lang w:eastAsia="zh-CN"/>
+        </w:rPr>
+      </w:pPr>
+      <w:r>
+        <w:rPr>
+          <w:rStyle w:val="7"/>
+          <w:rFonts w:hint="eastAsia" w:eastAsiaTheme="minorEastAsia"/>
+          <w:lang w:eastAsia="zh-CN"/>
+        </w:rPr>
+        <w:drawing>
+          <wp:inline distT="0" distB="0" distL="114300" distR="114300">
+            <wp:extent cx="5259705" cy="2510790"/>
+            <wp:effectExtent l="0" t="0" r="10795" b="3810"/>
+            <wp:docPr id="2" name="图片 2" descr="{E0657BFF-023B-4F5F-B56A-B93BF702770E}"/>
+            <wp:cNvGraphicFramePr>
+              <a:graphicFrameLocks xmlns:a="http://schemas.openxmlformats.org/drawingml/2006/main" noChangeAspect="1"/>
+            </wp:cNvGraphicFramePr>
+            <a:graphic xmlns:a="http://schemas.openxmlformats.org/drawingml/2006/main">
+              <a:graphicData uri="http://schemas.openxmlformats.org/drawingml/2006/picture">
+                <pic:pic xmlns:pic="http://schemas.openxmlformats.org/drawingml/2006/picture">
+                  <pic:nvPicPr>
+                    <pic:cNvPr id="2" name="图片 2" descr="{E0657BFF-023B-4F5F-B56A-B93BF702770E}"/>
+                    <pic:cNvPicPr>
+                      <a:picLocks noChangeAspect="1"/>
+                    </pic:cNvPicPr>
+                  </pic:nvPicPr>
+                  <pic:blipFill>
+                    <a:blip r:embed="rId4"/>
+                    <a:stretch>
+                      <a:fillRect/>
+                    </a:stretch>
+                  </pic:blipFill>
+                  <pic:spPr>
+                    <a:xfrm>
+                      <a:off x="0" y="0"/>
+                      <a:ext cx="5259705" cy="2510790"/>
+                    </a:xfrm>
+                    <a:prstGeom prst="rect">
+                      <a:avLst/>
+                    </a:prstGeom>
+                  </pic:spPr>
+                </pic:pic>
+              </a:graphicData>
+            </a:graphic>
+          </wp:inline>
+        </w:drawing>
       </w:r>
     </w:p>
     <w:p>
@@ -248,13 +323,65 @@
         <w:ind w:left="720" w:hanging="360"/>
       </w:pPr>
       <w:r>
-        <w:t xml:space="preserve">登录账号B，访问 </w:t>
+        <w:t>登录账号B</w:t>
+      </w:r>
+      <w:r>
+        <w:rPr>
+          <w:rFonts w:hint="eastAsia"/>
+          <w:lang w:eastAsia="zh-CN"/>
+        </w:rPr>
+        <w:t>（</w:t>
+      </w:r>
+      <w:r>
+        <w:rPr>
+          <w:rFonts w:hint="eastAsia"/>
+          <w:lang w:val="en-US" w:eastAsia="zh-CN"/>
+        </w:rPr>
+        <w:t>付**</w:t>
+      </w:r>
+      <w:r>
+        <w:rPr>
+          <w:rFonts w:hint="eastAsia"/>
+          <w:lang w:eastAsia="zh-CN"/>
+        </w:rPr>
+        <w:t>）</w:t>
+      </w:r>
+      <w:r>
+        <w:t xml:space="preserve">，访问 </w:t>
       </w:r>
       <w:r>
         <w:rPr>
           <w:rStyle w:val="7"/>
         </w:rPr>
-        <w:t>https://nwt.xjtu.edu.cn/jsed/framework/jsMain.jsp</w:t>
+        <w:t>https://</w:t>
+      </w:r>
+      <w:r>
+        <w:rPr>
+          <w:rStyle w:val="7"/>
+          <w:rFonts w:hint="eastAsia"/>
+          <w:lang w:val="en-US" w:eastAsia="zh-CN"/>
+        </w:rPr>
+        <w:t>jwxt</w:t>
+      </w:r>
+      <w:r>
+        <w:rPr>
+          <w:rStyle w:val="7"/>
+        </w:rPr>
+        <w:t>.xj</w:t>
+      </w:r>
+      <w:r>
+        <w:rPr>
+          <w:rStyle w:val="7"/>
+          <w:rFonts w:hint="eastAsia"/>
+          <w:lang w:val="en-US" w:eastAsia="zh-CN"/>
+        </w:rPr>
+        <w:t>ie</w:t>
+      </w:r>
+      <w:r>
+        <w:rPr>
+          <w:rStyle w:val="7"/>
+        </w:rPr>
+        <w:t>.edu.cn/jsed/framework/jsMain.jsp</w:t>
       </w:r>
       <w:r>
         <w:t>，使用Burp Suite抓取账号B访问修改个人信息页面请求。</w:t>
@@ -303,7 +430,7 @@
                     </pic:cNvPicPr>
                   </pic:nvPicPr>
                   <pic:blipFill>
-                    <a:blip r:embed="rId4"/>
+                    <a:blip r:embed="rId5"/>
                     <a:stretch>
                       <a:fillRect/>
                     </a:stretch>
@@ -393,7 +520,7 @@
                     </pic:cNvPicPr>
                   </pic:nvPicPr>
                   <pic:blipFill>
-                    <a:blip r:embed="rId5"/>
+                    <a:blip r:embed="rId6"/>
                     <a:stretch>
                       <a:fillRect/>
                     </a:stretch>
@@ -442,7 +569,7 @@
           <w:szCs w:val="24"/>
           <w:lang w:val="en-US" w:eastAsia="zh-CN"/>
         </w:rPr>
-        <w:t>账号A的核心信息页面</w:t>
+        <w:t>账号A（刘**）的核心信息页面</w:t>
       </w:r>
       <w:r>
         <w:rPr>
@@ -450,7 +577,42 @@
           <w:sz w:val="24"/>
           <w:szCs w:val="24"/>
         </w:rPr>
-        <w:t>，可清晰查看账号 A 的学号、身份证号、手机号、成绩、学籍状态等敏感信息；若访问修改类接口，可直接对账号 A 的个人信息 / 学业数据进行编辑、保存，修改操作直接生效，水平越权漏洞复现成功</w:t>
+        <w:t>，可清晰查看账号 A</w:t>
+      </w:r>
+      <w:r>
+        <w:rPr>
+          <w:rFonts w:hint="eastAsia" w:ascii="宋体" w:hAnsi="宋体" w:eastAsia="宋体" w:cs="宋体"/>
+          <w:sz w:val="24"/>
+          <w:szCs w:val="24"/>
+          <w:lang w:eastAsia="zh-CN"/>
+        </w:rPr>
+        <w:t>（</w:t>
+      </w:r>
+      <w:r>
+        <w:rPr>
+          <w:rFonts w:hint="eastAsia" w:ascii="宋体" w:hAnsi="宋体" w:eastAsia="宋体" w:cs="宋体"/>
+          <w:sz w:val="24"/>
+          <w:szCs w:val="24"/>
+          <w:lang w:val="en-US" w:eastAsia="zh-CN"/>
+        </w:rPr>
+        <w:t>刘</w:t>
+      </w:r>
+      <w:r>
+        <w:rPr>
+          <w:rFonts w:hint="eastAsia" w:ascii="宋体" w:hAnsi="宋体" w:eastAsia="宋体" w:cs="宋体"/>
+          <w:sz w:val="24"/>
+          <w:szCs w:val="24"/>
+          <w:lang w:eastAsia="zh-CN"/>
+        </w:rPr>
+        <w:t>）</w:t>
+      </w:r>
+      <w:r>
+        <w:rPr>
+          <w:rFonts w:ascii="宋体" w:hAnsi="宋体" w:eastAsia="宋体" w:cs="宋体"/>
+          <w:sz w:val="24"/>
+          <w:szCs w:val="24"/>
+        </w:rPr>
+        <w:t xml:space="preserve"> 的学号、身份证号、手机号、成绩、学籍状态等敏感信息；若访问修改类接口，可直接对账号 A 的个人信息 / 学业数据进行编辑、保存，修改操作直接生效，水平越权漏洞复现成功</w:t>
       </w:r>
       <w:r>
         <w:t>。</w:t>
@@ -460,7 +622,7 @@
           <w:rFonts w:hint="eastAsia"/>
           <w:lang w:val="en-US" w:eastAsia="zh-CN"/>
         </w:rPr>
-        <w:t>如图，可直接修改账号A的个人账号资料。</w:t>
+        <w:t>如图，可直接修改账号A（付）的个人账号资料。</w:t>
       </w:r>
     </w:p>
     <w:p>
@@ -506,7 +668,7 @@
                     </pic:cNvPicPr>
                   </pic:nvPicPr>
                   <pic:blipFill>
-                    <a:blip r:embed="rId6"/>
+                    <a:blip r:embed="rId7"/>
                     <a:stretch>
                       <a:fillRect/>
                     </a:stretch>

</xml_diff>

<commit_message>
vault backup: 2026-04-03 19:16:12
</commit_message>
<xml_diff>
--- a/计算机技术学习/漏洞报告/xjgc/新疆工程学院某系统存在会话认证缺陷漏洞.docx
+++ b/计算机技术学习/漏洞报告/xjgc/新疆工程学院某系统存在会话认证缺陷漏洞.docx
@@ -230,12 +230,15 @@
         <w:keepNext w:val="0"/>
         <w:keepLines w:val="0"/>
         <w:widowControl/>
-        <w:numPr>
-          <w:numId w:val="0"/>
-        </w:numPr>
-        <w:suppressLineNumbers w:val="0"/>
-        <w:spacing w:before="0" w:beforeAutospacing="1" w:after="0" w:afterAutospacing="1"/>
-        <w:ind w:left="360" w:leftChars="0"/>
+        <w:suppressLineNumbers w:val="0"/>
+        <w:pBdr>
+          <w:top w:val="none" w:color="auto" w:sz="0" w:space="0"/>
+          <w:left w:val="none" w:color="auto" w:sz="0" w:space="0"/>
+          <w:bottom w:val="none" w:color="auto" w:sz="0" w:space="0"/>
+          <w:right w:val="none" w:color="auto" w:sz="0" w:space="0"/>
+        </w:pBdr>
+        <w:spacing w:before="0" w:beforeAutospacing="0" w:after="0" w:afterAutospacing="0" w:line="240" w:lineRule="atLeast"/>
+        <w:ind w:left="0" w:right="0"/>
         <w:rPr>
           <w:rStyle w:val="7"/>
         </w:rPr>
@@ -245,6 +248,30 @@
           <w:rStyle w:val="7"/>
         </w:rPr>
         <w:t>Cookie: JSESSIONID=6BFA28BA4F5CCEE4742E9FCFA345C03A; SERVERID=122; JSESSIONID=3EED1D5D7446799F1F3D3898AD152D88</w:t>
+      </w:r>
+      <w:r>
+        <w:rPr>
+          <w:rStyle w:val="7"/>
+          <w:rFonts w:hint="eastAsia"/>
+          <w:lang w:val="en-US" w:eastAsia="zh-CN"/>
+        </w:rPr>
+        <w:t>0</w:t>
+      </w:r>
+      <w:r>
+        <w:rPr>
+          <w:rFonts w:hint="eastAsia" w:ascii="宋体" w:hAnsi="宋体" w:eastAsia="宋体" w:cs="宋体"/>
+          <w:sz w:val="24"/>
+        </w:rPr>
+        <w:t xml:space="preserve"> </w:t>
+      </w:r>
+      <w:r>
+        <w:rPr>
+          <w:color w:val="000000"/>
+          <w:sz w:val="16"/>
+          <w:szCs w:val="16"/>
+          <w:bdr w:val="none" w:color="auto" w:sz="0" w:space="0"/>
+        </w:rPr>
+        <w:t>（附：账号 A 登录后 Cookie 抓取截图）</w:t>
       </w:r>
     </w:p>
     <w:p>
@@ -622,8 +649,10 @@
           <w:rFonts w:hint="eastAsia"/>
           <w:lang w:val="en-US" w:eastAsia="zh-CN"/>
         </w:rPr>
-        <w:t>如图，可直接修改账号A（付）的个人账号资料。</w:t>
-      </w:r>
+        <w:t xml:space="preserve">如图，可直接修改账号A（刘）的个人账号资料。 </w:t>
+      </w:r>
+      <w:bookmarkStart w:id="0" w:name="_GoBack"/>
+      <w:bookmarkEnd w:id="0"/>
     </w:p>
     <w:p>
       <w:pPr>
@@ -1094,10 +1123,7 @@
         <w:t>：考虑使用HttpOnly、Secure等Cookie属性，防止XSS等攻击窃取Cookie；或采用Token-based认证，并对Token进行签名和时效控制。</w:t>
       </w:r>
     </w:p>
-    <w:p>
-      <w:bookmarkStart w:id="0" w:name="_GoBack"/>
-      <w:bookmarkEnd w:id="0"/>
-    </w:p>
+    <w:p/>
     <w:sectPr>
       <w:pgSz w:w="11906" w:h="16838"/>
       <w:pgMar w:top="1440" w:right="1800" w:bottom="1440" w:left="1800" w:header="851" w:footer="992" w:gutter="0"/>

</xml_diff>